<commit_message>
cambios en el documento
</commit_message>
<xml_diff>
--- a/Actividad 4 - Diseño del prototipo. (1).docx
+++ b/Actividad 4 - Diseño del prototipo. (1).docx
@@ -113,16 +113,6 @@
           <w:sz w:val="20"/>
         </w:rPr>
       </w:pPr>
-    </w:p>
-    <w:p>
-      <w:pPr>
-        <w:pStyle w:val="Textoindependiente"/>
-        <w:spacing w:before="124"/>
-        <w:rPr>
-          <w:b/>
-          <w:sz w:val="20"/>
-        </w:rPr>
-      </w:pPr>
       <w:r>
         <w:rPr>
           <w:b/>
@@ -130,13 +120,13 @@
           <w:sz w:val="20"/>
         </w:rPr>
         <w:drawing>
-          <wp:anchor distT="0" distB="0" distL="0" distR="0" simplePos="0" relativeHeight="487587840" behindDoc="1" locked="0" layoutInCell="1" allowOverlap="1" wp14:anchorId="79DF0B24" wp14:editId="7CBB6733">
+          <wp:anchor distT="0" distB="0" distL="0" distR="0" simplePos="0" relativeHeight="487587840" behindDoc="1" locked="0" layoutInCell="1" allowOverlap="1" wp14:anchorId="79DF0B24" wp14:editId="2C4417A9">
             <wp:simplePos x="0" y="0"/>
             <wp:positionH relativeFrom="page">
-              <wp:posOffset>2599677</wp:posOffset>
+              <wp:posOffset>2324735</wp:posOffset>
             </wp:positionH>
             <wp:positionV relativeFrom="paragraph">
-              <wp:posOffset>240333</wp:posOffset>
+              <wp:posOffset>279400</wp:posOffset>
             </wp:positionV>
             <wp:extent cx="2816662" cy="1092136"/>
             <wp:effectExtent l="0" t="0" r="0" b="0"/>
@@ -173,6 +163,16 @@
           </wp:anchor>
         </w:drawing>
       </w:r>
+    </w:p>
+    <w:p>
+      <w:pPr>
+        <w:pStyle w:val="Textoindependiente"/>
+        <w:spacing w:before="124"/>
+        <w:rPr>
+          <w:b/>
+          <w:sz w:val="20"/>
+        </w:rPr>
+      </w:pPr>
     </w:p>
     <w:p>
       <w:pPr>
@@ -32758,14 +32758,7 @@
             <w:rStyle w:val="Hipervnculo"/>
             <w:b/>
           </w:rPr>
-          <w:t xml:space="preserve">  </w:t>
-        </w:r>
-        <w:r>
-          <w:rPr>
-            <w:rStyle w:val="Hipervnculo"/>
-            <w:b/>
-          </w:rPr>
-          <w:t>https://youtu.be/VKsIGNVeVv0</w:t>
+          <w:t xml:space="preserve">  https://youtu.be/VKsIGNVeVv0</w:t>
         </w:r>
       </w:hyperlink>
     </w:p>
@@ -32795,27 +32788,6 @@
         <w:rPr>
           <w:b/>
           <w:color w:val="4F81BD" w:themeColor="accent1"/>
-          <w:u w:val="single"/>
-        </w:rPr>
-      </w:pPr>
-    </w:p>
-    <w:p>
-      <w:pPr>
-        <w:pStyle w:val="Textoindependiente"/>
-        <w:rPr>
-          <w:b/>
-          <w:color w:val="4F81BD" w:themeColor="accent1"/>
-          <w:u w:val="single"/>
-        </w:rPr>
-      </w:pPr>
-    </w:p>
-    <w:p>
-      <w:pPr>
-        <w:pStyle w:val="Textoindependiente"/>
-        <w:rPr>
-          <w:b/>
-          <w:color w:val="4F81BD" w:themeColor="accent1"/>
-          <w:u w:val="single"/>
         </w:rPr>
       </w:pPr>
     </w:p>
@@ -32916,9 +32888,18 @@
         <w:rPr>
           <w:spacing w:val="-2"/>
         </w:rPr>
-        <w:lastRenderedPageBreak/>
         <w:t>Arquitectura</w:t>
       </w:r>
+    </w:p>
+    <w:p>
+      <w:pPr>
+        <w:pStyle w:val="Ttulo1"/>
+        <w:tabs>
+          <w:tab w:val="left" w:pos="4187"/>
+        </w:tabs>
+        <w:spacing w:before="1"/>
+        <w:ind w:hanging="166"/>
+      </w:pPr>
     </w:p>
     <w:p>
       <w:pPr>

</xml_diff>